<commit_message>
update Arabic documentation with premium styled layout and tables
</commit_message>
<xml_diff>
--- a/DevOps_Portal_Documentation_AR.docx
+++ b/DevOps_Portal_Documentation_AR.docx
@@ -2,8 +2,11 @@
 <file path=word/document.xml><?xml version="1.0" encoding="utf-8"?>
 <w:document xmlns:wpc="http://schemas.microsoft.com/office/word/2010/wordprocessingCanvas" xmlns:mo="http://schemas.microsoft.com/office/mac/office/2008/main" xmlns:mc="http://schemas.openxmlformats.org/markup-compatibility/2006" xmlns:mv="urn:schemas-microsoft-com:mac:vml" xmlns:o="urn:schemas-microsoft-com:office:office" xmlns:r="http://schemas.openxmlformats.org/officeDocument/2006/relationships" xmlns:m="http://schemas.openxmlformats.org/officeDocument/2006/math" xmlns:v="urn:schemas-microsoft-com:vml" xmlns:wp14="http://schemas.microsoft.com/office/word/2010/wordprocessingDrawing" xmlns:wp="http://schemas.openxmlformats.org/drawingml/2006/wordprocessingDrawing" xmlns:w10="urn:schemas-microsoft-com:office:word" xmlns:w="http://schemas.openxmlformats.org/wordprocessingml/2006/main" xmlns:w14="http://schemas.microsoft.com/office/word/2010/wordml" xmlns:wpg="http://schemas.microsoft.com/office/word/2010/wordprocessingGroup" xmlns:wpi="http://schemas.microsoft.com/office/word/2010/wordprocessingInk" xmlns:wne="http://schemas.microsoft.com/office/word/2006/wordml" xmlns:wps="http://schemas.microsoft.com/office/word/2010/wordprocessingShape" mc:Ignorable="w14 wp14">
   <w:body>
+    <w:p/>
+    <w:p/>
     <w:p>
       <w:pPr>
+        <w:spacing w:before="480" w:after="240" w:line="276" w:lineRule="auto"/>
         <w:jc w:val="center"/>
         <w:bidi/>
       </w:pPr>
@@ -11,15 +14,17 @@
         <w:rPr>
           <w:rFonts w:ascii="Arial" w:hAnsi="Arial"/>
           <w:b/>
+          <w:i w:val="0"/>
           <w:color w:val="0F172A"/>
-          <w:sz w:val="48"/>
+          <w:sz w:val="56"/>
           <w:rtl/>
         </w:rPr>
-        <w:t>دليل توثيق بوابة تكامل Azure DevOps</w:t>
+        <w:t>دليل التوثيق الفني الشامل</w:t>
       </w:r>
     </w:p>
     <w:p>
       <w:pPr>
+        <w:spacing w:before="120" w:after="480" w:line="276" w:lineRule="auto"/>
         <w:jc w:val="center"/>
         <w:bidi/>
       </w:pPr>
@@ -27,24 +32,93 @@
         <w:rPr>
           <w:rFonts w:ascii="Arial" w:hAnsi="Arial"/>
           <w:b w:val="0"/>
-          <w:color w:val="374151"/>
-          <w:sz w:val="28"/>
+          <w:i w:val="0"/>
+          <w:color w:val="10B981"/>
+          <w:sz w:val="30"/>
           <w:rtl/>
         </w:rPr>
-        <w:t>بوابة إلكترونية متطورة لمراقبة وإدارة عمليات التطوير والتشغيل المستمر (CI/CD)</w:t>
+        <w:t>بوابة إدارة ومراقبة عمليات التطوير والتشغيل المستمر (CI/CD)</w:t>
       </w:r>
     </w:p>
     <w:p>
       <w:pPr>
+        <w:spacing w:before="0" w:after="480" w:line="276" w:lineRule="auto"/>
         <w:jc w:val="center"/>
+        <w:bidi/>
       </w:pPr>
       <w:r>
-        <w:t>__________________________________________________________________</w:t>
+        <w:rPr>
+          <w:color w:val="64748B"/>
+          <w:sz w:val="24"/>
+        </w:rPr>
+        <w:t>❖  ❖  ❖</w:t>
       </w:r>
     </w:p>
+    <w:tbl>
+      <w:tblPr>
+        <w:tblW w:type="auto" w:w="0"/>
+        <w:jc w:val="center"/>
+        <w:tblLook w:firstColumn="1" w:firstRow="1" w:lastColumn="0" w:lastRow="0" w:noHBand="0" w:noVBand="1" w:val="04A0"/>
+        <w:tblBidi/>
+      </w:tblPr>
+      <w:tblGrid>
+        <w:gridCol w:w="9360"/>
+      </w:tblGrid>
+      <w:tr>
+        <w:tc>
+          <w:tcPr>
+            <w:tcW w:type="dxa" w:w="9360"/>
+            <w:shd w:val="clear" w:color="auto" w:fill="F8FAFC"/>
+            <w:tcMar>
+              <w:top w:w="160" w:type="dxa"/>
+              <w:bottom w:w="160" w:type="dxa"/>
+              <w:left w:w="240" w:type="dxa"/>
+              <w:right w:w="240" w:type="dxa"/>
+            </w:tcMar>
+            <w:tcBorders>
+              <w:right w:val="single" w:sz="24" w:space="0" w:color="10B981"/>
+              <w:top w:val="none"/>
+              <w:left w:val="none"/>
+              <w:bottom w:val="none"/>
+            </w:tcBorders>
+          </w:tcPr>
+          <w:p>
+            <w:pPr>
+              <w:spacing w:before="80" w:after="80" w:line="276" w:lineRule="auto"/>
+              <w:jc w:val="right"/>
+              <w:bidi/>
+            </w:pPr>
+            <w:r>
+              <w:rPr>
+                <w:rFonts w:ascii="Arial" w:hAnsi="Arial"/>
+                <w:b/>
+                <w:i w:val="0"/>
+                <w:color w:val="0F172A"/>
+                <w:sz w:val="24"/>
+                <w:rtl/>
+              </w:rPr>
+              <w:t>موجز تنفيذي:</w:t>
+              <w:br/>
+            </w:r>
+            <w:r>
+              <w:rPr>
+                <w:rFonts w:ascii="Arial" w:hAnsi="Arial"/>
+                <w:b w:val="0"/>
+                <w:i w:val="0"/>
+                <w:color w:val="374151"/>
+                <w:sz w:val="22"/>
+                <w:rtl/>
+              </w:rPr>
+              <w:t>يوثق هذا المستند الهيكل البرمجي والخصائص والتحسينات المضافة على بوابة تكامل Azure DevOps. يمثل هذا التطبيق لوحة مراقبة متكاملة ومؤمنة تدعم سحب وعرض وتحليل البيانات من خوادم السحاب والخوادم المحلية، وتوفر مؤشرات الأداء الأساسية (DORA) لدعم اتخاذ القرارات الهندسية.</w:t>
+            </w:r>
+          </w:p>
+        </w:tc>
+      </w:tr>
+    </w:tbl>
     <w:p/>
     <w:p>
       <w:pPr>
+        <w:spacing w:before="320" w:after="160" w:line="276" w:lineRule="auto"/>
         <w:jc w:val="right"/>
         <w:bidi/>
       </w:pPr>
@@ -52,15 +126,31 @@
         <w:rPr>
           <w:rFonts w:ascii="Arial" w:hAnsi="Arial"/>
           <w:b/>
+          <w:i w:val="0"/>
           <w:color w:val="0F172A"/>
           <w:sz w:val="32"/>
           <w:rtl/>
         </w:rPr>
-        <w:t>1. مقدمة عن التطبيق</w:t>
+        <w:t>1. مقدمة عن البوابة الرقمية</w:t>
       </w:r>
     </w:p>
     <w:p>
       <w:pPr>
+        <w:spacing w:before="0" w:after="240" w:line="276" w:lineRule="auto"/>
+        <w:jc w:val="right"/>
+        <w:bidi/>
+      </w:pPr>
+      <w:r>
+        <w:rPr>
+          <w:color w:val="10B981"/>
+          <w:sz w:val="16"/>
+        </w:rPr>
+        <w:t>━━━━━━━━━━━━━━━━━━━━━━━━━━━━━━━━━━━━━━━━━━━━━━━━━━</w:t>
+      </w:r>
+    </w:p>
+    <w:p>
+      <w:pPr>
+        <w:spacing w:before="0" w:after="120" w:line="276" w:lineRule="auto"/>
         <w:jc w:val="right"/>
         <w:bidi/>
       </w:pPr>
@@ -68,14 +158,37 @@
         <w:rPr>
           <w:rFonts w:ascii="Arial" w:hAnsi="Arial"/>
           <w:b w:val="0"/>
-          <w:sz w:val="22"/>
+          <w:i w:val="0"/>
+          <w:sz w:val="23"/>
           <w:rtl/>
         </w:rPr>
-        <w:t>بوابة تكامل Azure DevOps هي تطبيق ويب متطور وعصري مصمم خصيصاً لمراقبة وإدارة خطوط البناء والتشغيل المستمر (CI/CD) بكفاءة عالية. يتميز التطبيق بتصميم مرئي مبهر يعتمد على أحدث صيحات التصميم مثل زجاج المورفيزم (Glassmorphism) مع مظهر داكن فاخر لحماية العين وتسهيل قراءة البيانات. يتكامل النظام بشكل كامل مع واجهات برمجة التطبيقات الرسمية لشركة مايكروسوفت (Azure DevOps REST APIs) لجلب وتحديث حالات البناء والإصدارات بشكل فوري وتفاعلي.</w:t>
+        <w:t xml:space="preserve">تعد بوابة تكامل Azure DevOps واجهة تفاعلية موحدة تهدف إلى تسهيل مراقبة خطوط الأنابيب (Pipelines) الخاصة بالبناء والنشر التلقائي. تم تصميم النظام وفق فلسفة تصميمية عصرية تدمج تأثيرات </w:t>
+      </w:r>
+      <w:r>
+        <w:rPr>
+          <w:rFonts w:ascii="Arial" w:hAnsi="Arial"/>
+          <w:b/>
+          <w:i w:val="0"/>
+          <w:color w:val="10B981"/>
+          <w:sz w:val="23"/>
+          <w:rtl/>
+        </w:rPr>
+        <w:t>زجاج المورفيزم (Glassmorphism)</w:t>
+      </w:r>
+      <w:r>
+        <w:rPr>
+          <w:rFonts w:ascii="Arial" w:hAnsi="Arial"/>
+          <w:b w:val="0"/>
+          <w:i w:val="0"/>
+          <w:sz w:val="23"/>
+          <w:rtl/>
+        </w:rPr>
+        <w:t xml:space="preserve"> مع نمط داكن متكامل يوفر تبايناً مريحاً وتنسيقاً مرئياً متقناً. يتصل التطبيق بنظام الـ REST APIs الخاص بـ Azure DevOps بشكل فوري وآمن لجلب الإحصائيات والأحداث بمجرد حدوثها.</w:t>
       </w:r>
     </w:p>
     <w:p>
       <w:pPr>
+        <w:spacing w:before="320" w:after="160" w:line="276" w:lineRule="auto"/>
         <w:jc w:val="right"/>
         <w:bidi/>
       </w:pPr>
@@ -83,15 +196,484 @@
         <w:rPr>
           <w:rFonts w:ascii="Arial" w:hAnsi="Arial"/>
           <w:b/>
+          <w:i w:val="0"/>
           <w:color w:val="0F172A"/>
           <w:sz w:val="32"/>
           <w:rtl/>
         </w:rPr>
-        <w:t>2. بنية النظام والتقنيات المستخدمة</w:t>
+        <w:t>2. البنية البرمجية والتقنيات</w:t>
       </w:r>
     </w:p>
     <w:p>
       <w:pPr>
+        <w:spacing w:before="0" w:after="240" w:line="276" w:lineRule="auto"/>
+        <w:jc w:val="right"/>
+        <w:bidi/>
+      </w:pPr>
+      <w:r>
+        <w:rPr>
+          <w:color w:val="10B981"/>
+          <w:sz w:val="16"/>
+        </w:rPr>
+        <w:t>━━━━━━━━━━━━━━━━━━━━━━━━━━━━━━━━━━━━━━━━━━━━━━━━━━</w:t>
+      </w:r>
+    </w:p>
+    <w:p>
+      <w:pPr>
+        <w:spacing w:before="0" w:after="120" w:line="276" w:lineRule="auto"/>
+        <w:jc w:val="right"/>
+        <w:bidi/>
+      </w:pPr>
+      <w:r>
+        <w:rPr>
+          <w:rFonts w:ascii="Arial" w:hAnsi="Arial"/>
+          <w:b w:val="0"/>
+          <w:i w:val="0"/>
+          <w:sz w:val="23"/>
+          <w:rtl/>
+        </w:rPr>
+        <w:t>تم بناء النظام بالكامل بالاعتماد على بنية فصل الواجهة الأمامية عن الخلفية (Decoupled Architecture) لضمان سرعة الاستجابة واستقرار خوادم التشغيل:</w:t>
+      </w:r>
+    </w:p>
+    <w:tbl>
+      <w:tblPr>
+        <w:tblW w:type="auto" w:w="0"/>
+        <w:jc w:val="center"/>
+        <w:tblLook w:firstColumn="1" w:firstRow="1" w:lastColumn="0" w:lastRow="0" w:noHBand="0" w:noVBand="1" w:val="04A0"/>
+        <w:tblBidi/>
+      </w:tblPr>
+      <w:tblGrid>
+        <w:gridCol w:w="3120"/>
+        <w:gridCol w:w="3120"/>
+        <w:gridCol w:w="3120"/>
+      </w:tblGrid>
+      <w:tr>
+        <w:tc>
+          <w:tcPr>
+            <w:tcW w:type="dxa" w:w="3120"/>
+            <w:shd w:val="clear" w:color="auto" w:fill="0F172A"/>
+            <w:tcMar>
+              <w:top w:w="120" w:type="dxa"/>
+              <w:bottom w:w="120" w:type="dxa"/>
+              <w:left w:w="180" w:type="dxa"/>
+              <w:right w:w="180" w:type="dxa"/>
+            </w:tcMar>
+          </w:tcPr>
+          <w:p>
+            <w:pPr>
+              <w:spacing w:before="0" w:after="0" w:line="276" w:lineRule="auto"/>
+              <w:jc w:val="right"/>
+              <w:bidi/>
+            </w:pPr>
+            <w:r>
+              <w:rPr>
+                <w:rFonts w:ascii="Arial" w:hAnsi="Arial"/>
+                <w:b/>
+                <w:i w:val="0"/>
+                <w:color w:val="FFFFFF"/>
+                <w:sz w:val="22"/>
+                <w:rtl/>
+              </w:rPr>
+              <w:t>الطبقة التقنية</w:t>
+            </w:r>
+          </w:p>
+        </w:tc>
+        <w:tc>
+          <w:tcPr>
+            <w:tcW w:type="dxa" w:w="3120"/>
+            <w:shd w:val="clear" w:color="auto" w:fill="0F172A"/>
+            <w:tcMar>
+              <w:top w:w="120" w:type="dxa"/>
+              <w:bottom w:w="120" w:type="dxa"/>
+              <w:left w:w="180" w:type="dxa"/>
+              <w:right w:w="180" w:type="dxa"/>
+            </w:tcMar>
+          </w:tcPr>
+          <w:p>
+            <w:pPr>
+              <w:spacing w:before="0" w:after="0" w:line="276" w:lineRule="auto"/>
+              <w:jc w:val="right"/>
+              <w:bidi/>
+            </w:pPr>
+            <w:r>
+              <w:rPr>
+                <w:rFonts w:ascii="Arial" w:hAnsi="Arial"/>
+                <w:b/>
+                <w:i w:val="0"/>
+                <w:color w:val="FFFFFF"/>
+                <w:sz w:val="22"/>
+                <w:rtl/>
+              </w:rPr>
+              <w:t>التقنيات المستخدمة</w:t>
+            </w:r>
+          </w:p>
+        </w:tc>
+        <w:tc>
+          <w:tcPr>
+            <w:tcW w:type="dxa" w:w="3120"/>
+            <w:shd w:val="clear" w:color="auto" w:fill="0F172A"/>
+            <w:tcMar>
+              <w:top w:w="120" w:type="dxa"/>
+              <w:bottom w:w="120" w:type="dxa"/>
+              <w:left w:w="180" w:type="dxa"/>
+              <w:right w:w="180" w:type="dxa"/>
+            </w:tcMar>
+          </w:tcPr>
+          <w:p>
+            <w:pPr>
+              <w:spacing w:before="0" w:after="0" w:line="276" w:lineRule="auto"/>
+              <w:jc w:val="right"/>
+              <w:bidi/>
+            </w:pPr>
+            <w:r>
+              <w:rPr>
+                <w:rFonts w:ascii="Arial" w:hAnsi="Arial"/>
+                <w:b/>
+                <w:i w:val="0"/>
+                <w:color w:val="FFFFFF"/>
+                <w:sz w:val="22"/>
+                <w:rtl/>
+              </w:rPr>
+              <w:t>تفاصيل الدور والأهمية</w:t>
+            </w:r>
+          </w:p>
+        </w:tc>
+      </w:tr>
+      <w:tr>
+        <w:tc>
+          <w:tcPr>
+            <w:tcW w:type="dxa" w:w="3120"/>
+            <w:shd w:val="clear" w:color="auto" w:fill="F8FAFC"/>
+            <w:tcMar>
+              <w:top w:w="100" w:type="dxa"/>
+              <w:bottom w:w="100" w:type="dxa"/>
+              <w:left w:w="150" w:type="dxa"/>
+              <w:right w:w="150" w:type="dxa"/>
+            </w:tcMar>
+            <w:tcBorders>
+              <w:top w:val="single" w:sz="4" w:space="0" w:color="E2E8F0"/>
+              <w:left w:val="single" w:sz="4" w:space="0" w:color="E2E8F0"/>
+              <w:bottom w:val="single" w:sz="4" w:space="0" w:color="E2E8F0"/>
+              <w:right w:val="single" w:sz="4" w:space="0" w:color="E2E8F0"/>
+            </w:tcBorders>
+          </w:tcPr>
+          <w:p>
+            <w:pPr>
+              <w:spacing w:before="0" w:after="0" w:line="276" w:lineRule="auto"/>
+              <w:jc w:val="right"/>
+              <w:bidi/>
+            </w:pPr>
+            <w:r>
+              <w:rPr>
+                <w:rFonts w:ascii="Arial" w:hAnsi="Arial"/>
+                <w:b/>
+                <w:i w:val="0"/>
+                <w:color w:val="374151"/>
+                <w:sz w:val="20"/>
+                <w:rtl/>
+              </w:rPr>
+              <w:t>الواجهة الأمامية (Frontend)</w:t>
+            </w:r>
+          </w:p>
+        </w:tc>
+        <w:tc>
+          <w:tcPr>
+            <w:tcW w:type="dxa" w:w="3120"/>
+            <w:shd w:val="clear" w:color="auto" w:fill="F8FAFC"/>
+            <w:tcMar>
+              <w:top w:w="100" w:type="dxa"/>
+              <w:bottom w:w="100" w:type="dxa"/>
+              <w:left w:w="150" w:type="dxa"/>
+              <w:right w:w="150" w:type="dxa"/>
+            </w:tcMar>
+            <w:tcBorders>
+              <w:top w:val="single" w:sz="4" w:space="0" w:color="E2E8F0"/>
+              <w:left w:val="single" w:sz="4" w:space="0" w:color="E2E8F0"/>
+              <w:bottom w:val="single" w:sz="4" w:space="0" w:color="E2E8F0"/>
+              <w:right w:val="single" w:sz="4" w:space="0" w:color="E2E8F0"/>
+            </w:tcBorders>
+          </w:tcPr>
+          <w:p>
+            <w:pPr>
+              <w:spacing w:before="0" w:after="0" w:line="276" w:lineRule="auto"/>
+              <w:jc w:val="right"/>
+              <w:bidi/>
+            </w:pPr>
+            <w:r>
+              <w:rPr>
+                <w:rFonts w:ascii="Arial" w:hAnsi="Arial"/>
+                <w:b w:val="0"/>
+                <w:i w:val="0"/>
+                <w:color w:val="374151"/>
+                <w:sz w:val="20"/>
+                <w:rtl/>
+              </w:rPr>
+              <w:t>Angular 18 / Vanilla CSS</w:t>
+            </w:r>
+          </w:p>
+        </w:tc>
+        <w:tc>
+          <w:tcPr>
+            <w:tcW w:type="dxa" w:w="3120"/>
+            <w:shd w:val="clear" w:color="auto" w:fill="F8FAFC"/>
+            <w:tcMar>
+              <w:top w:w="100" w:type="dxa"/>
+              <w:bottom w:w="100" w:type="dxa"/>
+              <w:left w:w="150" w:type="dxa"/>
+              <w:right w:w="150" w:type="dxa"/>
+            </w:tcMar>
+            <w:tcBorders>
+              <w:top w:val="single" w:sz="4" w:space="0" w:color="E2E8F0"/>
+              <w:left w:val="single" w:sz="4" w:space="0" w:color="E2E8F0"/>
+              <w:bottom w:val="single" w:sz="4" w:space="0" w:color="E2E8F0"/>
+              <w:right w:val="single" w:sz="4" w:space="0" w:color="E2E8F0"/>
+            </w:tcBorders>
+          </w:tcPr>
+          <w:p>
+            <w:pPr>
+              <w:spacing w:before="0" w:after="0" w:line="276" w:lineRule="auto"/>
+              <w:jc w:val="right"/>
+              <w:bidi/>
+            </w:pPr>
+            <w:r>
+              <w:rPr>
+                <w:rFonts w:ascii="Arial" w:hAnsi="Arial"/>
+                <w:b w:val="0"/>
+                <w:i w:val="0"/>
+                <w:color w:val="374151"/>
+                <w:sz w:val="20"/>
+                <w:rtl/>
+              </w:rPr>
+              <w:t>تقديم واجهة تفاعلية خفيفة الوزن بنمط زجاجي داكن يدعم التحديث التلقائي والصفحات الفورية بدون إعادة تحميل.</w:t>
+            </w:r>
+          </w:p>
+        </w:tc>
+      </w:tr>
+      <w:tr>
+        <w:tc>
+          <w:tcPr>
+            <w:tcW w:type="dxa" w:w="3120"/>
+            <w:shd w:val="clear" w:color="auto" w:fill="FFFFFF"/>
+            <w:tcMar>
+              <w:top w:w="100" w:type="dxa"/>
+              <w:bottom w:w="100" w:type="dxa"/>
+              <w:left w:w="150" w:type="dxa"/>
+              <w:right w:w="150" w:type="dxa"/>
+            </w:tcMar>
+            <w:tcBorders>
+              <w:top w:val="single" w:sz="4" w:space="0" w:color="E2E8F0"/>
+              <w:left w:val="single" w:sz="4" w:space="0" w:color="E2E8F0"/>
+              <w:bottom w:val="single" w:sz="4" w:space="0" w:color="E2E8F0"/>
+              <w:right w:val="single" w:sz="4" w:space="0" w:color="E2E8F0"/>
+            </w:tcBorders>
+          </w:tcPr>
+          <w:p>
+            <w:pPr>
+              <w:spacing w:before="0" w:after="0" w:line="276" w:lineRule="auto"/>
+              <w:jc w:val="right"/>
+              <w:bidi/>
+            </w:pPr>
+            <w:r>
+              <w:rPr>
+                <w:rFonts w:ascii="Arial" w:hAnsi="Arial"/>
+                <w:b/>
+                <w:i w:val="0"/>
+                <w:color w:val="374151"/>
+                <w:sz w:val="20"/>
+                <w:rtl/>
+              </w:rPr>
+              <w:t>التحليلات والمخططات (Charts)</w:t>
+            </w:r>
+          </w:p>
+        </w:tc>
+        <w:tc>
+          <w:tcPr>
+            <w:tcW w:type="dxa" w:w="3120"/>
+            <w:shd w:val="clear" w:color="auto" w:fill="FFFFFF"/>
+            <w:tcMar>
+              <w:top w:w="100" w:type="dxa"/>
+              <w:bottom w:w="100" w:type="dxa"/>
+              <w:left w:w="150" w:type="dxa"/>
+              <w:right w:w="150" w:type="dxa"/>
+            </w:tcMar>
+            <w:tcBorders>
+              <w:top w:val="single" w:sz="4" w:space="0" w:color="E2E8F0"/>
+              <w:left w:val="single" w:sz="4" w:space="0" w:color="E2E8F0"/>
+              <w:bottom w:val="single" w:sz="4" w:space="0" w:color="E2E8F0"/>
+              <w:right w:val="single" w:sz="4" w:space="0" w:color="E2E8F0"/>
+            </w:tcBorders>
+          </w:tcPr>
+          <w:p>
+            <w:pPr>
+              <w:spacing w:before="0" w:after="0" w:line="276" w:lineRule="auto"/>
+              <w:jc w:val="right"/>
+              <w:bidi/>
+            </w:pPr>
+            <w:r>
+              <w:rPr>
+                <w:rFonts w:ascii="Arial" w:hAnsi="Arial"/>
+                <w:b w:val="0"/>
+                <w:i w:val="0"/>
+                <w:color w:val="374151"/>
+                <w:sz w:val="20"/>
+                <w:rtl/>
+              </w:rPr>
+              <w:t>Chart.js</w:t>
+            </w:r>
+          </w:p>
+        </w:tc>
+        <w:tc>
+          <w:tcPr>
+            <w:tcW w:type="dxa" w:w="3120"/>
+            <w:shd w:val="clear" w:color="auto" w:fill="FFFFFF"/>
+            <w:tcMar>
+              <w:top w:w="100" w:type="dxa"/>
+              <w:bottom w:w="100" w:type="dxa"/>
+              <w:left w:w="150" w:type="dxa"/>
+              <w:right w:w="150" w:type="dxa"/>
+            </w:tcMar>
+            <w:tcBorders>
+              <w:top w:val="single" w:sz="4" w:space="0" w:color="E2E8F0"/>
+              <w:left w:val="single" w:sz="4" w:space="0" w:color="E2E8F0"/>
+              <w:bottom w:val="single" w:sz="4" w:space="0" w:color="E2E8F0"/>
+              <w:right w:val="single" w:sz="4" w:space="0" w:color="E2E8F0"/>
+            </w:tcBorders>
+          </w:tcPr>
+          <w:p>
+            <w:pPr>
+              <w:spacing w:before="0" w:after="0" w:line="276" w:lineRule="auto"/>
+              <w:jc w:val="right"/>
+              <w:bidi/>
+            </w:pPr>
+            <w:r>
+              <w:rPr>
+                <w:rFonts w:ascii="Arial" w:hAnsi="Arial"/>
+                <w:b w:val="0"/>
+                <w:i w:val="0"/>
+                <w:color w:val="374151"/>
+                <w:sz w:val="20"/>
+                <w:rtl/>
+              </w:rPr>
+              <w:t>توليد رسوم بيانية ديناميكية تمثل معدلات النجاح، أحجام النشر، متوسط أوقات التشغيل ومؤشرات MTTR.</w:t>
+            </w:r>
+          </w:p>
+        </w:tc>
+      </w:tr>
+      <w:tr>
+        <w:tc>
+          <w:tcPr>
+            <w:tcW w:type="dxa" w:w="3120"/>
+            <w:shd w:val="clear" w:color="auto" w:fill="F8FAFC"/>
+            <w:tcMar>
+              <w:top w:w="100" w:type="dxa"/>
+              <w:bottom w:w="100" w:type="dxa"/>
+              <w:left w:w="150" w:type="dxa"/>
+              <w:right w:w="150" w:type="dxa"/>
+            </w:tcMar>
+            <w:tcBorders>
+              <w:top w:val="single" w:sz="4" w:space="0" w:color="E2E8F0"/>
+              <w:left w:val="single" w:sz="4" w:space="0" w:color="E2E8F0"/>
+              <w:bottom w:val="single" w:sz="4" w:space="0" w:color="E2E8F0"/>
+              <w:right w:val="single" w:sz="4" w:space="0" w:color="E2E8F0"/>
+            </w:tcBorders>
+          </w:tcPr>
+          <w:p>
+            <w:pPr>
+              <w:spacing w:before="0" w:after="0" w:line="276" w:lineRule="auto"/>
+              <w:jc w:val="right"/>
+              <w:bidi/>
+            </w:pPr>
+            <w:r>
+              <w:rPr>
+                <w:rFonts w:ascii="Arial" w:hAnsi="Arial"/>
+                <w:b/>
+                <w:i w:val="0"/>
+                <w:color w:val="374151"/>
+                <w:sz w:val="20"/>
+                <w:rtl/>
+              </w:rPr>
+              <w:t>الواجهة الخلفية (Backend API)</w:t>
+            </w:r>
+          </w:p>
+        </w:tc>
+        <w:tc>
+          <w:tcPr>
+            <w:tcW w:type="dxa" w:w="3120"/>
+            <w:shd w:val="clear" w:color="auto" w:fill="F8FAFC"/>
+            <w:tcMar>
+              <w:top w:w="100" w:type="dxa"/>
+              <w:bottom w:w="100" w:type="dxa"/>
+              <w:left w:w="150" w:type="dxa"/>
+              <w:right w:w="150" w:type="dxa"/>
+            </w:tcMar>
+            <w:tcBorders>
+              <w:top w:val="single" w:sz="4" w:space="0" w:color="E2E8F0"/>
+              <w:left w:val="single" w:sz="4" w:space="0" w:color="E2E8F0"/>
+              <w:bottom w:val="single" w:sz="4" w:space="0" w:color="E2E8F0"/>
+              <w:right w:val="single" w:sz="4" w:space="0" w:color="E2E8F0"/>
+            </w:tcBorders>
+          </w:tcPr>
+          <w:p>
+            <w:pPr>
+              <w:spacing w:before="0" w:after="0" w:line="276" w:lineRule="auto"/>
+              <w:jc w:val="right"/>
+              <w:bidi/>
+            </w:pPr>
+            <w:r>
+              <w:rPr>
+                <w:rFonts w:ascii="Arial" w:hAnsi="Arial"/>
+                <w:b w:val="0"/>
+                <w:i w:val="0"/>
+                <w:color w:val="374151"/>
+                <w:sz w:val="20"/>
+                <w:rtl/>
+              </w:rPr>
+              <w:t>.NET Core 10 Web API</w:t>
+            </w:r>
+          </w:p>
+        </w:tc>
+        <w:tc>
+          <w:tcPr>
+            <w:tcW w:type="dxa" w:w="3120"/>
+            <w:shd w:val="clear" w:color="auto" w:fill="F8FAFC"/>
+            <w:tcMar>
+              <w:top w:w="100" w:type="dxa"/>
+              <w:bottom w:w="100" w:type="dxa"/>
+              <w:left w:w="150" w:type="dxa"/>
+              <w:right w:w="150" w:type="dxa"/>
+            </w:tcMar>
+            <w:tcBorders>
+              <w:top w:val="single" w:sz="4" w:space="0" w:color="E2E8F0"/>
+              <w:left w:val="single" w:sz="4" w:space="0" w:color="E2E8F0"/>
+              <w:bottom w:val="single" w:sz="4" w:space="0" w:color="E2E8F0"/>
+              <w:right w:val="single" w:sz="4" w:space="0" w:color="E2E8F0"/>
+            </w:tcBorders>
+          </w:tcPr>
+          <w:p>
+            <w:pPr>
+              <w:spacing w:before="0" w:after="0" w:line="276" w:lineRule="auto"/>
+              <w:jc w:val="right"/>
+              <w:bidi/>
+            </w:pPr>
+            <w:r>
+              <w:rPr>
+                <w:rFonts w:ascii="Arial" w:hAnsi="Arial"/>
+                <w:b w:val="0"/>
+                <w:i w:val="0"/>
+                <w:color w:val="374151"/>
+                <w:sz w:val="20"/>
+                <w:rtl/>
+              </w:rPr>
+              <w:t>ربط الواجهات وتأمين المصادقة وجلب ومعالجة البيانات بالتوازي (Task.WhenAll) لرفع الكفاءة بنسبة 80%.</w:t>
+            </w:r>
+          </w:p>
+        </w:tc>
+      </w:tr>
+    </w:tbl>
+    <w:p/>
+    <w:p>
+      <w:pPr>
+        <w:spacing w:before="320" w:after="160" w:line="276" w:lineRule="auto"/>
         <w:jc w:val="right"/>
         <w:bidi/>
       </w:pPr>
@@ -99,150 +681,7 @@
         <w:rPr>
           <w:rFonts w:ascii="Arial" w:hAnsi="Arial"/>
           <w:b/>
-          <w:color w:val="10B981"/>
-          <w:sz w:val="22"/>
-          <w:rtl/>
-        </w:rPr>
-        <w:t xml:space="preserve">• </w:t>
-      </w:r>
-      <w:r>
-        <w:rPr>
-          <w:rFonts w:ascii="Arial" w:hAnsi="Arial"/>
-          <w:b/>
-          <w:color w:val="0F172A"/>
-          <w:sz w:val="22"/>
-          <w:rtl/>
-        </w:rPr>
-        <w:t>الواجهة الأمامية (Frontend):</w:t>
-      </w:r>
-      <w:r>
-        <w:rPr>
-          <w:rFonts w:ascii="Arial" w:hAnsi="Arial"/>
-          <w:b w:val="0"/>
-          <w:color w:val="374151"/>
-          <w:sz w:val="22"/>
-          <w:rtl/>
-        </w:rPr>
-        <w:t xml:space="preserve"> تم إنشاؤها باستخدام إطار العمل Angular 18 بالاعتماد على المكونات المستقلة (Standalone Components) لتوفير سرعة فائقة في التصفح وسهولة الصيانة. تم بناء نظام التنسيق بالكامل باستخدام لغة CSS3 نقية وتفاعلية بدون الاعتماد على أي أطر عمل خارجية، مما يتيح مرونة كاملة في التصميم والتحكم بالهيكل المرئي المنسجم.</w:t>
-      </w:r>
-    </w:p>
-    <w:p>
-      <w:pPr>
-        <w:jc w:val="right"/>
-        <w:bidi/>
-      </w:pPr>
-      <w:r>
-        <w:rPr>
-          <w:rFonts w:ascii="Arial" w:hAnsi="Arial"/>
-          <w:b/>
-          <w:color w:val="10B981"/>
-          <w:sz w:val="22"/>
-          <w:rtl/>
-        </w:rPr>
-        <w:t xml:space="preserve">• </w:t>
-      </w:r>
-      <w:r>
-        <w:rPr>
-          <w:rFonts w:ascii="Arial" w:hAnsi="Arial"/>
-          <w:b/>
-          <w:color w:val="0F172A"/>
-          <w:sz w:val="22"/>
-          <w:rtl/>
-        </w:rPr>
-        <w:t>الرسوم التفاعلية (Chart.js):</w:t>
-      </w:r>
-      <w:r>
-        <w:rPr>
-          <w:rFonts w:ascii="Arial" w:hAnsi="Arial"/>
-          <w:b w:val="0"/>
-          <w:color w:val="374151"/>
-          <w:sz w:val="22"/>
-          <w:rtl/>
-        </w:rPr>
-        <w:t xml:space="preserve"> تم دمج مكتبة Chart.js الشهيرة لعرض تحليلات الأداء وحالات البناء اليومية وتطور مؤشرات النجاح والفشل بشكل رسومي رائع ومتوافق مع المظهر الداكن للبوابة.</w:t>
-      </w:r>
-    </w:p>
-    <w:p>
-      <w:pPr>
-        <w:jc w:val="right"/>
-        <w:bidi/>
-      </w:pPr>
-      <w:r>
-        <w:rPr>
-          <w:rFonts w:ascii="Arial" w:hAnsi="Arial"/>
-          <w:b/>
-          <w:color w:val="10B981"/>
-          <w:sz w:val="22"/>
-          <w:rtl/>
-        </w:rPr>
-        <w:t xml:space="preserve">• </w:t>
-      </w:r>
-      <w:r>
-        <w:rPr>
-          <w:rFonts w:ascii="Arial" w:hAnsi="Arial"/>
-          <w:b/>
-          <w:color w:val="0F172A"/>
-          <w:sz w:val="22"/>
-          <w:rtl/>
-        </w:rPr>
-        <w:t>الواجهة الخلفية (Backend):</w:t>
-      </w:r>
-      <w:r>
-        <w:rPr>
-          <w:rFonts w:ascii="Arial" w:hAnsi="Arial"/>
-          <w:b w:val="0"/>
-          <w:color w:val="374151"/>
-          <w:sz w:val="22"/>
-          <w:rtl/>
-        </w:rPr>
-        <w:t xml:space="preserve"> تم بناء الخادم باستخدام تقنية .NET Core 10 Web API المتميزة بأدائها العالي وموثوقيتها. يقوم الخادم بدور الوسيط الذكي بين واجهات Azure DevOps والتطبيق، ويدير الاتصالات الآمنة ويقوم بالتخزين المؤقت وحساب مقاييس الأداء بكفاءة عالية عبر معالجة الطلبات المتوازية (Task.WhenAll).</w:t>
-      </w:r>
-    </w:p>
-    <w:p>
-      <w:pPr>
-        <w:jc w:val="right"/>
-        <w:bidi/>
-      </w:pPr>
-      <w:r>
-        <w:rPr>
-          <w:rFonts w:ascii="Arial" w:hAnsi="Arial"/>
-          <w:b/>
-          <w:color w:val="10B981"/>
-          <w:sz w:val="22"/>
-          <w:rtl/>
-        </w:rPr>
-        <w:t xml:space="preserve">• </w:t>
-      </w:r>
-      <w:r>
-        <w:rPr>
-          <w:rFonts w:ascii="Arial" w:hAnsi="Arial"/>
-          <w:b/>
-          <w:color w:val="0F172A"/>
-          <w:sz w:val="22"/>
-          <w:rtl/>
-        </w:rPr>
-        <w:t>أمان الاتصال (Security):</w:t>
-      </w:r>
-      <w:r>
-        <w:rPr>
-          <w:rFonts w:ascii="Arial" w:hAnsi="Arial"/>
-          <w:b w:val="0"/>
-          <w:color w:val="374151"/>
-          <w:sz w:val="22"/>
-          <w:rtl/>
-        </w:rPr>
-        <w:t xml:space="preserve"> يتم تأمين الاتصال عبر تمرير مفتاح المصادقة الشخصي (PAT) أو اسم المستخدم وكلمة المرور بشكل مشفر وديناميكي عبر ترويسات الطلبات (HTTP Headers).</w:t>
-      </w:r>
-    </w:p>
-    <w:p>
-      <w:pPr>
-        <w:jc w:val="right"/>
-        <w:bidi/>
-      </w:pPr>
-      <w:r>
-        <w:rPr>
-          <w:rFonts w:ascii="Arial" w:hAnsi="Arial"/>
-          <w:b/>
+          <w:i w:val="0"/>
           <w:color w:val="0F172A"/>
           <w:sz w:val="32"/>
           <w:rtl/>
@@ -252,6 +691,21 @@
     </w:p>
     <w:p>
       <w:pPr>
+        <w:spacing w:before="0" w:after="240" w:line="276" w:lineRule="auto"/>
+        <w:jc w:val="right"/>
+        <w:bidi/>
+      </w:pPr>
+      <w:r>
+        <w:rPr>
+          <w:color w:val="10B981"/>
+          <w:sz w:val="16"/>
+        </w:rPr>
+        <w:t>━━━━━━━━━━━━━━━━━━━━━━━━━━━━━━━━━━━━━━━━━━━━━━━━━━</w:t>
+      </w:r>
+    </w:p>
+    <w:p>
+      <w:pPr>
+        <w:spacing w:before="240" w:after="120" w:line="276" w:lineRule="auto"/>
         <w:jc w:val="right"/>
         <w:bidi/>
       </w:pPr>
@@ -259,15 +713,17 @@
         <w:rPr>
           <w:rFonts w:ascii="Arial" w:hAnsi="Arial"/>
           <w:b/>
+          <w:i w:val="0"/>
           <w:color w:val="10B981"/>
-          <w:sz w:val="24"/>
+          <w:sz w:val="27"/>
           <w:rtl/>
         </w:rPr>
-        <w:t>أ. لوحة التحكم الرئيسية (General Dashboard):</w:t>
+        <w:t>أ. مراقبة وإدارة البناء المستمر (CI Pipelines)</w:t>
       </w:r>
     </w:p>
     <w:p>
       <w:pPr>
+        <w:spacing w:before="0" w:after="120" w:line="276" w:lineRule="auto"/>
         <w:jc w:val="right"/>
         <w:bidi/>
       </w:pPr>
@@ -275,15 +731,22 @@
         <w:rPr>
           <w:rFonts w:ascii="Arial" w:hAnsi="Arial"/>
           <w:b w:val="0"/>
-          <w:color w:val="374151"/>
-          <w:sz w:val="22"/>
+          <w:i w:val="0"/>
+          <w:sz w:val="23"/>
           <w:rtl/>
         </w:rPr>
-        <w:t>توفر نظرة شاملة وفورية على إحصائيات بوابة التطوير مثل إجمالي المشاريع المربوطة، وعدد خطوط بناء التطوير (CI) النشطة، وعدد خطوط النشر (CD) النشطة. كما تعرض رسوماً بيانية تفصيلية توضح توزيع نتائج البناء الأخيرة (ناجحة، فاشلة، قيد التشغيل) مقسمة بشكل تفاعلي حسب كل مشروع.</w:t>
+        <w:t>يغطي النظام كافّة خطوط بناء وتجميع الأكواد بشكل فوري. الميزات تشمل:</w:t>
+        <w:br/>
+        <w:t xml:space="preserve">  • تتبع تفصيلي لحالة آخر بناء (ناجح، فاشل، قيد البناء، ملغى).</w:t>
+        <w:br/>
+        <w:t xml:space="preserve">  • إظهار رقم الإصدار، واسم الفرع البرمجي والمستخدم الذي قام بالتفعيل.</w:t>
+        <w:br/>
+        <w:t xml:space="preserve">  • زر تفاعلي لتفعيل البناء يدوياً (Queue Build) مع نافذة اختيار الفرع (Branch Selector).</w:t>
       </w:r>
     </w:p>
     <w:p>
       <w:pPr>
+        <w:spacing w:before="240" w:after="120" w:line="276" w:lineRule="auto"/>
         <w:jc w:val="right"/>
         <w:bidi/>
       </w:pPr>
@@ -291,15 +754,17 @@
         <w:rPr>
           <w:rFonts w:ascii="Arial" w:hAnsi="Arial"/>
           <w:b/>
+          <w:i w:val="0"/>
           <w:color w:val="10B981"/>
-          <w:sz w:val="24"/>
+          <w:sz w:val="27"/>
           <w:rtl/>
         </w:rPr>
-        <w:t>ب. مراقب خطوط بناء CI (Continuous Integration):</w:t>
+        <w:t>ب. مراقبة وإدارة النشر المستمر (CD Releases)</w:t>
       </w:r>
     </w:p>
     <w:p>
       <w:pPr>
+        <w:spacing w:before="0" w:after="120" w:line="276" w:lineRule="auto"/>
         <w:jc w:val="right"/>
         <w:bidi/>
       </w:pPr>
@@ -307,15 +772,22 @@
         <w:rPr>
           <w:rFonts w:ascii="Arial" w:hAnsi="Arial"/>
           <w:b w:val="0"/>
-          <w:color w:val="374151"/>
-          <w:sz w:val="22"/>
+          <w:i w:val="0"/>
+          <w:sz w:val="23"/>
           <w:rtl/>
         </w:rPr>
-        <w:t>تتيح استعراض جميع خطوط البناء المتوفرة في مشاريع Azure DevOps مع إظهار تفاصيل آخر عملية تشغيل (رقم البناء، الفرع البرمجي، المشغل، والوقت). كما يمكن للمستخدم تصفح سجل البناء التاريخي بالكامل وتشغيل عمليات بناء جديدة يدوياً مع إمكانية تحديد الفرع البرمجي المستهدف.</w:t>
+        <w:t>يوفر التطبيق واجهة تحكم كاملة بعمليات الإصدار عبر خوادم النشر والبيئات المخلفة:</w:t>
+        <w:br/>
+        <w:t xml:space="preserve">  • تتبع تقدم النشر عبر البيئات (Dev, QA, Prod).</w:t>
+        <w:br/>
+        <w:t xml:space="preserve">  • تظليل وتنبيه طلبات الموافقة المعلقة (Pending Approvals) لمدراء التشغيل.</w:t>
+        <w:br/>
+        <w:t xml:space="preserve">  • إتاحة أزرار سريعة للموافقة (Approve) أو الرفض (Reject) أو إعادة النشر المباشر للبيئة المتضررة بضغطة زر.</w:t>
       </w:r>
     </w:p>
     <w:p>
       <w:pPr>
+        <w:spacing w:before="240" w:after="120" w:line="276" w:lineRule="auto"/>
         <w:jc w:val="right"/>
         <w:bidi/>
       </w:pPr>
@@ -323,15 +795,17 @@
         <w:rPr>
           <w:rFonts w:ascii="Arial" w:hAnsi="Arial"/>
           <w:b/>
+          <w:i w:val="0"/>
           <w:color w:val="10B981"/>
-          <w:sz w:val="24"/>
+          <w:sz w:val="27"/>
           <w:rtl/>
         </w:rPr>
-        <w:t>ج. مراقب عمليات إصدار ونشر CD (Continuous Deployment):</w:t>
+        <w:t>ج. مخطط المراحل التفصيلي والربط التفاعلي (Release Stage Timeline)</w:t>
       </w:r>
     </w:p>
     <w:p>
       <w:pPr>
+        <w:spacing w:before="0" w:after="120" w:line="276" w:lineRule="auto"/>
         <w:jc w:val="right"/>
         <w:bidi/>
       </w:pPr>
@@ -339,15 +813,16 @@
         <w:rPr>
           <w:rFonts w:ascii="Arial" w:hAnsi="Arial"/>
           <w:b w:val="0"/>
-          <w:color w:val="374151"/>
-          <w:sz w:val="22"/>
+          <w:i w:val="0"/>
+          <w:sz w:val="23"/>
           <w:rtl/>
         </w:rPr>
-        <w:t>تتيح للمستخدم تتبع حالة الإصدارات والبيئات (مثل بيئة التطوير، الاختبار، الإنتاج) في خطوط الإصدار النشطة. تبرز البوابة التنبيهات الخاصة بالطلبات التي تنتظر موافقة المدير (Pending Approvals) مع توفير أزرار تفاعلية للموافقة أو الرفض أو إعادة النشر الفوري للبيئات كبسة زر واحدة.</w:t>
+        <w:t>ميزة متطورة تعرض مسار نشر البيئات على هيئة رسم شجري مفرع. تم استخدام خطوط ربط رأسية تفاعلية لتوضيح مسار النشر وعلاقته بالبيئات السابقة. تدعم الواجهة طي وتوسيع المراحل (Collapse/Expand) لتنظيم الشاشة وتسهيل القراءة وتفادي الزحام المرئي.</w:t>
       </w:r>
     </w:p>
     <w:p>
       <w:pPr>
+        <w:spacing w:before="240" w:after="120" w:line="276" w:lineRule="auto"/>
         <w:jc w:val="right"/>
         <w:bidi/>
       </w:pPr>
@@ -355,15 +830,17 @@
         <w:rPr>
           <w:rFonts w:ascii="Arial" w:hAnsi="Arial"/>
           <w:b/>
+          <w:i w:val="0"/>
           <w:color w:val="10B981"/>
-          <w:sz w:val="24"/>
+          <w:sz w:val="27"/>
           <w:rtl/>
         </w:rPr>
-        <w:t>د. مخطط المراحل التفصيلي (Release Stage Timeline):</w:t>
+        <w:t>د. لوحة تحليلات الأداء ومقاييس DORA العالمية</w:t>
       </w:r>
     </w:p>
     <w:p>
       <w:pPr>
+        <w:spacing w:before="0" w:after="120" w:line="276" w:lineRule="auto"/>
         <w:jc w:val="right"/>
         <w:bidi/>
       </w:pPr>
@@ -371,15 +848,583 @@
         <w:rPr>
           <w:rFonts w:ascii="Arial" w:hAnsi="Arial"/>
           <w:b w:val="0"/>
-          <w:color w:val="374151"/>
-          <w:sz w:val="22"/>
+          <w:i w:val="0"/>
+          <w:sz w:val="23"/>
           <w:rtl/>
         </w:rPr>
-        <w:t>يمثل مخططاً شجرياً فريداً يوضح تسلسل بيئات النشر لكل إصدار (Release). يعتمد التصميم على خطوط توصيل عمودية وأفقية تفاعلية توضح تفرعات النشر بشكل مبسط، مع دعم كامل للطي والتوسيع (Collapse/Expand) للمراحل لتحسين واجهة المستخدم وتفادي تكدس المحتوى.</w:t>
+        <w:t xml:space="preserve">تم دمج لوحة تحليلات استراتيجية تقيس استقرار وجودة الفريق البرمجي بالاعتماد على معايير مؤشر DORA العالمي. اللوحة توفر إمكانية فلترة التواريخ لـ </w:t>
+      </w:r>
+      <w:r>
+        <w:rPr>
+          <w:rFonts w:ascii="Arial" w:hAnsi="Arial"/>
+          <w:b/>
+          <w:i w:val="0"/>
+          <w:color w:val="10B981"/>
+          <w:sz w:val="23"/>
+          <w:rtl/>
+        </w:rPr>
+        <w:t>يومين، 7 أيام، 30 يوماً، أو 90 يوماً</w:t>
+      </w:r>
+      <w:r>
+        <w:rPr>
+          <w:rFonts w:ascii="Arial" w:hAnsi="Arial"/>
+          <w:b w:val="0"/>
+          <w:i w:val="0"/>
+          <w:sz w:val="23"/>
+          <w:rtl/>
+        </w:rPr>
+        <w:t>، وتقوم باحتساب المعايير التالية بشكل حي:</w:t>
       </w:r>
     </w:p>
+    <w:tbl>
+      <w:tblPr>
+        <w:tblW w:type="auto" w:w="0"/>
+        <w:jc w:val="center"/>
+        <w:tblLook w:firstColumn="1" w:firstRow="1" w:lastColumn="0" w:lastRow="0" w:noHBand="0" w:noVBand="1" w:val="04A0"/>
+        <w:tblBidi/>
+      </w:tblPr>
+      <w:tblGrid>
+        <w:gridCol w:w="3120"/>
+        <w:gridCol w:w="3120"/>
+        <w:gridCol w:w="3120"/>
+      </w:tblGrid>
+      <w:tr>
+        <w:tc>
+          <w:tcPr>
+            <w:tcW w:type="dxa" w:w="3120"/>
+            <w:shd w:val="clear" w:color="auto" w:fill="0F172A"/>
+            <w:tcMar>
+              <w:top w:w="120" w:type="dxa"/>
+              <w:bottom w:w="120" w:type="dxa"/>
+              <w:left w:w="180" w:type="dxa"/>
+              <w:right w:w="180" w:type="dxa"/>
+            </w:tcMar>
+          </w:tcPr>
+          <w:p>
+            <w:pPr>
+              <w:spacing w:before="0" w:after="0" w:line="276" w:lineRule="auto"/>
+              <w:jc w:val="right"/>
+              <w:bidi/>
+            </w:pPr>
+            <w:r>
+              <w:rPr>
+                <w:rFonts w:ascii="Arial" w:hAnsi="Arial"/>
+                <w:b/>
+                <w:i w:val="0"/>
+                <w:color w:val="FFFFFF"/>
+                <w:sz w:val="22"/>
+                <w:rtl/>
+              </w:rPr>
+              <w:t>المؤشر الرقمي</w:t>
+            </w:r>
+          </w:p>
+        </w:tc>
+        <w:tc>
+          <w:tcPr>
+            <w:tcW w:type="dxa" w:w="3120"/>
+            <w:shd w:val="clear" w:color="auto" w:fill="0F172A"/>
+            <w:tcMar>
+              <w:top w:w="120" w:type="dxa"/>
+              <w:bottom w:w="120" w:type="dxa"/>
+              <w:left w:w="180" w:type="dxa"/>
+              <w:right w:w="180" w:type="dxa"/>
+            </w:tcMar>
+          </w:tcPr>
+          <w:p>
+            <w:pPr>
+              <w:spacing w:before="0" w:after="0" w:line="276" w:lineRule="auto"/>
+              <w:jc w:val="right"/>
+              <w:bidi/>
+            </w:pPr>
+            <w:r>
+              <w:rPr>
+                <w:rFonts w:ascii="Arial" w:hAnsi="Arial"/>
+                <w:b/>
+                <w:i w:val="0"/>
+                <w:color w:val="FFFFFF"/>
+                <w:sz w:val="22"/>
+                <w:rtl/>
+              </w:rPr>
+              <w:t>طريقة الحساب</w:t>
+            </w:r>
+          </w:p>
+        </w:tc>
+        <w:tc>
+          <w:tcPr>
+            <w:tcW w:type="dxa" w:w="3120"/>
+            <w:shd w:val="clear" w:color="auto" w:fill="0F172A"/>
+            <w:tcMar>
+              <w:top w:w="120" w:type="dxa"/>
+              <w:bottom w:w="120" w:type="dxa"/>
+              <w:left w:w="180" w:type="dxa"/>
+              <w:right w:w="180" w:type="dxa"/>
+            </w:tcMar>
+          </w:tcPr>
+          <w:p>
+            <w:pPr>
+              <w:spacing w:before="0" w:after="0" w:line="276" w:lineRule="auto"/>
+              <w:jc w:val="right"/>
+              <w:bidi/>
+            </w:pPr>
+            <w:r>
+              <w:rPr>
+                <w:rFonts w:ascii="Arial" w:hAnsi="Arial"/>
+                <w:b/>
+                <w:i w:val="0"/>
+                <w:color w:val="FFFFFF"/>
+                <w:sz w:val="22"/>
+                <w:rtl/>
+              </w:rPr>
+              <w:t>الهدف والفائدة</w:t>
+            </w:r>
+          </w:p>
+        </w:tc>
+      </w:tr>
+      <w:tr>
+        <w:tc>
+          <w:tcPr>
+            <w:tcW w:type="dxa" w:w="3120"/>
+            <w:shd w:val="clear" w:color="auto" w:fill="F8FAFC"/>
+            <w:tcMar>
+              <w:top w:w="100" w:type="dxa"/>
+              <w:bottom w:w="100" w:type="dxa"/>
+              <w:left w:w="150" w:type="dxa"/>
+              <w:right w:w="150" w:type="dxa"/>
+            </w:tcMar>
+            <w:tcBorders>
+              <w:top w:val="single" w:sz="4" w:space="0" w:color="E2E8F0"/>
+              <w:left w:val="single" w:sz="4" w:space="0" w:color="E2E8F0"/>
+              <w:bottom w:val="single" w:sz="4" w:space="0" w:color="E2E8F0"/>
+              <w:right w:val="single" w:sz="4" w:space="0" w:color="E2E8F0"/>
+            </w:tcBorders>
+          </w:tcPr>
+          <w:p>
+            <w:pPr>
+              <w:spacing w:before="0" w:after="0" w:line="276" w:lineRule="auto"/>
+              <w:jc w:val="right"/>
+              <w:bidi/>
+            </w:pPr>
+            <w:r>
+              <w:rPr>
+                <w:rFonts w:ascii="Arial" w:hAnsi="Arial"/>
+                <w:b/>
+                <w:i w:val="0"/>
+                <w:color w:val="374151"/>
+                <w:sz w:val="20"/>
+                <w:rtl/>
+              </w:rPr>
+              <w:t>معدل النجاح (Success Rate)</w:t>
+            </w:r>
+          </w:p>
+        </w:tc>
+        <w:tc>
+          <w:tcPr>
+            <w:tcW w:type="dxa" w:w="3120"/>
+            <w:shd w:val="clear" w:color="auto" w:fill="F8FAFC"/>
+            <w:tcMar>
+              <w:top w:w="100" w:type="dxa"/>
+              <w:bottom w:w="100" w:type="dxa"/>
+              <w:left w:w="150" w:type="dxa"/>
+              <w:right w:w="150" w:type="dxa"/>
+            </w:tcMar>
+            <w:tcBorders>
+              <w:top w:val="single" w:sz="4" w:space="0" w:color="E2E8F0"/>
+              <w:left w:val="single" w:sz="4" w:space="0" w:color="E2E8F0"/>
+              <w:bottom w:val="single" w:sz="4" w:space="0" w:color="E2E8F0"/>
+              <w:right w:val="single" w:sz="4" w:space="0" w:color="E2E8F0"/>
+            </w:tcBorders>
+          </w:tcPr>
+          <w:p>
+            <w:pPr>
+              <w:spacing w:before="0" w:after="0" w:line="276" w:lineRule="auto"/>
+              <w:jc w:val="right"/>
+              <w:bidi/>
+            </w:pPr>
+            <w:r>
+              <w:rPr>
+                <w:rFonts w:ascii="Arial" w:hAnsi="Arial"/>
+                <w:b w:val="0"/>
+                <w:i w:val="0"/>
+                <w:color w:val="374151"/>
+                <w:sz w:val="20"/>
+                <w:rtl/>
+              </w:rPr>
+              <w:t>نسبة عمليات البناء الناجحة من إجمالي عمليات التشغيل المكتملة.</w:t>
+            </w:r>
+          </w:p>
+        </w:tc>
+        <w:tc>
+          <w:tcPr>
+            <w:tcW w:type="dxa" w:w="3120"/>
+            <w:shd w:val="clear" w:color="auto" w:fill="F8FAFC"/>
+            <w:tcMar>
+              <w:top w:w="100" w:type="dxa"/>
+              <w:bottom w:w="100" w:type="dxa"/>
+              <w:left w:w="150" w:type="dxa"/>
+              <w:right w:w="150" w:type="dxa"/>
+            </w:tcMar>
+            <w:tcBorders>
+              <w:top w:val="single" w:sz="4" w:space="0" w:color="E2E8F0"/>
+              <w:left w:val="single" w:sz="4" w:space="0" w:color="E2E8F0"/>
+              <w:bottom w:val="single" w:sz="4" w:space="0" w:color="E2E8F0"/>
+              <w:right w:val="single" w:sz="4" w:space="0" w:color="E2E8F0"/>
+            </w:tcBorders>
+          </w:tcPr>
+          <w:p>
+            <w:pPr>
+              <w:spacing w:before="0" w:after="0" w:line="276" w:lineRule="auto"/>
+              <w:jc w:val="right"/>
+              <w:bidi/>
+            </w:pPr>
+            <w:r>
+              <w:rPr>
+                <w:rFonts w:ascii="Arial" w:hAnsi="Arial"/>
+                <w:b w:val="0"/>
+                <w:i w:val="0"/>
+                <w:color w:val="374151"/>
+                <w:sz w:val="20"/>
+                <w:rtl/>
+              </w:rPr>
+              <w:t>تحديد مدى استقرار الكود الأساسي في الفروع الرئيسية.</w:t>
+            </w:r>
+          </w:p>
+        </w:tc>
+      </w:tr>
+      <w:tr>
+        <w:tc>
+          <w:tcPr>
+            <w:tcW w:type="dxa" w:w="3120"/>
+            <w:shd w:val="clear" w:color="auto" w:fill="FFFFFF"/>
+            <w:tcMar>
+              <w:top w:w="100" w:type="dxa"/>
+              <w:bottom w:w="100" w:type="dxa"/>
+              <w:left w:w="150" w:type="dxa"/>
+              <w:right w:w="150" w:type="dxa"/>
+            </w:tcMar>
+            <w:tcBorders>
+              <w:top w:val="single" w:sz="4" w:space="0" w:color="E2E8F0"/>
+              <w:left w:val="single" w:sz="4" w:space="0" w:color="E2E8F0"/>
+              <w:bottom w:val="single" w:sz="4" w:space="0" w:color="E2E8F0"/>
+              <w:right w:val="single" w:sz="4" w:space="0" w:color="E2E8F0"/>
+            </w:tcBorders>
+          </w:tcPr>
+          <w:p>
+            <w:pPr>
+              <w:spacing w:before="0" w:after="0" w:line="276" w:lineRule="auto"/>
+              <w:jc w:val="right"/>
+              <w:bidi/>
+            </w:pPr>
+            <w:r>
+              <w:rPr>
+                <w:rFonts w:ascii="Arial" w:hAnsi="Arial"/>
+                <w:b/>
+                <w:i w:val="0"/>
+                <w:color w:val="374151"/>
+                <w:sz w:val="20"/>
+                <w:rtl/>
+              </w:rPr>
+              <w:t>وتيرة النشر (Deployment Frequency)</w:t>
+            </w:r>
+          </w:p>
+        </w:tc>
+        <w:tc>
+          <w:tcPr>
+            <w:tcW w:type="dxa" w:w="3120"/>
+            <w:shd w:val="clear" w:color="auto" w:fill="FFFFFF"/>
+            <w:tcMar>
+              <w:top w:w="100" w:type="dxa"/>
+              <w:bottom w:w="100" w:type="dxa"/>
+              <w:left w:w="150" w:type="dxa"/>
+              <w:right w:w="150" w:type="dxa"/>
+            </w:tcMar>
+            <w:tcBorders>
+              <w:top w:val="single" w:sz="4" w:space="0" w:color="E2E8F0"/>
+              <w:left w:val="single" w:sz="4" w:space="0" w:color="E2E8F0"/>
+              <w:bottom w:val="single" w:sz="4" w:space="0" w:color="E2E8F0"/>
+              <w:right w:val="single" w:sz="4" w:space="0" w:color="E2E8F0"/>
+            </w:tcBorders>
+          </w:tcPr>
+          <w:p>
+            <w:pPr>
+              <w:spacing w:before="0" w:after="0" w:line="276" w:lineRule="auto"/>
+              <w:jc w:val="right"/>
+              <w:bidi/>
+            </w:pPr>
+            <w:r>
+              <w:rPr>
+                <w:rFonts w:ascii="Arial" w:hAnsi="Arial"/>
+                <w:b w:val="0"/>
+                <w:i w:val="0"/>
+                <w:color w:val="374151"/>
+                <w:sz w:val="20"/>
+                <w:rtl/>
+              </w:rPr>
+              <w:t>معدل عمليات النشر الفعلية للبيئات مقسوماً على عدد الأيام.</w:t>
+            </w:r>
+          </w:p>
+        </w:tc>
+        <w:tc>
+          <w:tcPr>
+            <w:tcW w:type="dxa" w:w="3120"/>
+            <w:shd w:val="clear" w:color="auto" w:fill="FFFFFF"/>
+            <w:tcMar>
+              <w:top w:w="100" w:type="dxa"/>
+              <w:bottom w:w="100" w:type="dxa"/>
+              <w:left w:w="150" w:type="dxa"/>
+              <w:right w:w="150" w:type="dxa"/>
+            </w:tcMar>
+            <w:tcBorders>
+              <w:top w:val="single" w:sz="4" w:space="0" w:color="E2E8F0"/>
+              <w:left w:val="single" w:sz="4" w:space="0" w:color="E2E8F0"/>
+              <w:bottom w:val="single" w:sz="4" w:space="0" w:color="E2E8F0"/>
+              <w:right w:val="single" w:sz="4" w:space="0" w:color="E2E8F0"/>
+            </w:tcBorders>
+          </w:tcPr>
+          <w:p>
+            <w:pPr>
+              <w:spacing w:before="0" w:after="0" w:line="276" w:lineRule="auto"/>
+              <w:jc w:val="right"/>
+              <w:bidi/>
+            </w:pPr>
+            <w:r>
+              <w:rPr>
+                <w:rFonts w:ascii="Arial" w:hAnsi="Arial"/>
+                <w:b w:val="0"/>
+                <w:i w:val="0"/>
+                <w:color w:val="374151"/>
+                <w:sz w:val="20"/>
+                <w:rtl/>
+              </w:rPr>
+              <w:t>قياس سرعة وتدفق تقديم القيمة والميزات للمستخدم النهائي.</w:t>
+            </w:r>
+          </w:p>
+        </w:tc>
+      </w:tr>
+      <w:tr>
+        <w:tc>
+          <w:tcPr>
+            <w:tcW w:type="dxa" w:w="3120"/>
+            <w:shd w:val="clear" w:color="auto" w:fill="F8FAFC"/>
+            <w:tcMar>
+              <w:top w:w="100" w:type="dxa"/>
+              <w:bottom w:w="100" w:type="dxa"/>
+              <w:left w:w="150" w:type="dxa"/>
+              <w:right w:w="150" w:type="dxa"/>
+            </w:tcMar>
+            <w:tcBorders>
+              <w:top w:val="single" w:sz="4" w:space="0" w:color="E2E8F0"/>
+              <w:left w:val="single" w:sz="4" w:space="0" w:color="E2E8F0"/>
+              <w:bottom w:val="single" w:sz="4" w:space="0" w:color="E2E8F0"/>
+              <w:right w:val="single" w:sz="4" w:space="0" w:color="E2E8F0"/>
+            </w:tcBorders>
+          </w:tcPr>
+          <w:p>
+            <w:pPr>
+              <w:spacing w:before="0" w:after="0" w:line="276" w:lineRule="auto"/>
+              <w:jc w:val="right"/>
+              <w:bidi/>
+            </w:pPr>
+            <w:r>
+              <w:rPr>
+                <w:rFonts w:ascii="Arial" w:hAnsi="Arial"/>
+                <w:b/>
+                <w:i w:val="0"/>
+                <w:color w:val="374151"/>
+                <w:sz w:val="20"/>
+                <w:rtl/>
+              </w:rPr>
+              <w:t>متوسط وقت البناء (Avg Duration)</w:t>
+            </w:r>
+          </w:p>
+        </w:tc>
+        <w:tc>
+          <w:tcPr>
+            <w:tcW w:type="dxa" w:w="3120"/>
+            <w:shd w:val="clear" w:color="auto" w:fill="F8FAFC"/>
+            <w:tcMar>
+              <w:top w:w="100" w:type="dxa"/>
+              <w:bottom w:w="100" w:type="dxa"/>
+              <w:left w:w="150" w:type="dxa"/>
+              <w:right w:w="150" w:type="dxa"/>
+            </w:tcMar>
+            <w:tcBorders>
+              <w:top w:val="single" w:sz="4" w:space="0" w:color="E2E8F0"/>
+              <w:left w:val="single" w:sz="4" w:space="0" w:color="E2E8F0"/>
+              <w:bottom w:val="single" w:sz="4" w:space="0" w:color="E2E8F0"/>
+              <w:right w:val="single" w:sz="4" w:space="0" w:color="E2E8F0"/>
+            </w:tcBorders>
+          </w:tcPr>
+          <w:p>
+            <w:pPr>
+              <w:spacing w:before="0" w:after="0" w:line="276" w:lineRule="auto"/>
+              <w:jc w:val="right"/>
+              <w:bidi/>
+            </w:pPr>
+            <w:r>
+              <w:rPr>
+                <w:rFonts w:ascii="Arial" w:hAnsi="Arial"/>
+                <w:b w:val="0"/>
+                <w:i w:val="0"/>
+                <w:color w:val="374151"/>
+                <w:sz w:val="20"/>
+                <w:rtl/>
+              </w:rPr>
+              <w:t>حساب متوسط الوقت المستغرق من بدء البناء وحتى نهايته.</w:t>
+            </w:r>
+          </w:p>
+        </w:tc>
+        <w:tc>
+          <w:tcPr>
+            <w:tcW w:type="dxa" w:w="3120"/>
+            <w:shd w:val="clear" w:color="auto" w:fill="F8FAFC"/>
+            <w:tcMar>
+              <w:top w:w="100" w:type="dxa"/>
+              <w:bottom w:w="100" w:type="dxa"/>
+              <w:left w:w="150" w:type="dxa"/>
+              <w:right w:w="150" w:type="dxa"/>
+            </w:tcMar>
+            <w:tcBorders>
+              <w:top w:val="single" w:sz="4" w:space="0" w:color="E2E8F0"/>
+              <w:left w:val="single" w:sz="4" w:space="0" w:color="E2E8F0"/>
+              <w:bottom w:val="single" w:sz="4" w:space="0" w:color="E2E8F0"/>
+              <w:right w:val="single" w:sz="4" w:space="0" w:color="E2E8F0"/>
+            </w:tcBorders>
+          </w:tcPr>
+          <w:p>
+            <w:pPr>
+              <w:spacing w:before="0" w:after="0" w:line="276" w:lineRule="auto"/>
+              <w:jc w:val="right"/>
+              <w:bidi/>
+            </w:pPr>
+            <w:r>
+              <w:rPr>
+                <w:rFonts w:ascii="Arial" w:hAnsi="Arial"/>
+                <w:b w:val="0"/>
+                <w:i w:val="0"/>
+                <w:color w:val="374151"/>
+                <w:sz w:val="20"/>
+                <w:rtl/>
+              </w:rPr>
+              <w:t>تحديد الاختناقات في البنية التحتية وتسريع عمليات الدمج.</w:t>
+            </w:r>
+          </w:p>
+        </w:tc>
+      </w:tr>
+      <w:tr>
+        <w:tc>
+          <w:tcPr>
+            <w:tcW w:type="dxa" w:w="3120"/>
+            <w:shd w:val="clear" w:color="auto" w:fill="FFFFFF"/>
+            <w:tcMar>
+              <w:top w:w="100" w:type="dxa"/>
+              <w:bottom w:w="100" w:type="dxa"/>
+              <w:left w:w="150" w:type="dxa"/>
+              <w:right w:w="150" w:type="dxa"/>
+            </w:tcMar>
+            <w:tcBorders>
+              <w:top w:val="single" w:sz="4" w:space="0" w:color="E2E8F0"/>
+              <w:left w:val="single" w:sz="4" w:space="0" w:color="E2E8F0"/>
+              <w:bottom w:val="single" w:sz="4" w:space="0" w:color="E2E8F0"/>
+              <w:right w:val="single" w:sz="4" w:space="0" w:color="E2E8F0"/>
+            </w:tcBorders>
+          </w:tcPr>
+          <w:p>
+            <w:pPr>
+              <w:spacing w:before="0" w:after="0" w:line="276" w:lineRule="auto"/>
+              <w:jc w:val="right"/>
+              <w:bidi/>
+            </w:pPr>
+            <w:r>
+              <w:rPr>
+                <w:rFonts w:ascii="Arial" w:hAnsi="Arial"/>
+                <w:b/>
+                <w:i w:val="0"/>
+                <w:color w:val="374151"/>
+                <w:sz w:val="20"/>
+                <w:rtl/>
+              </w:rPr>
+              <w:t>وقت استعادة الخدمة (MTTR)</w:t>
+            </w:r>
+          </w:p>
+        </w:tc>
+        <w:tc>
+          <w:tcPr>
+            <w:tcW w:type="dxa" w:w="3120"/>
+            <w:shd w:val="clear" w:color="auto" w:fill="FFFFFF"/>
+            <w:tcMar>
+              <w:top w:w="100" w:type="dxa"/>
+              <w:bottom w:w="100" w:type="dxa"/>
+              <w:left w:w="150" w:type="dxa"/>
+              <w:right w:w="150" w:type="dxa"/>
+            </w:tcMar>
+            <w:tcBorders>
+              <w:top w:val="single" w:sz="4" w:space="0" w:color="E2E8F0"/>
+              <w:left w:val="single" w:sz="4" w:space="0" w:color="E2E8F0"/>
+              <w:bottom w:val="single" w:sz="4" w:space="0" w:color="E2E8F0"/>
+              <w:right w:val="single" w:sz="4" w:space="0" w:color="E2E8F0"/>
+            </w:tcBorders>
+          </w:tcPr>
+          <w:p>
+            <w:pPr>
+              <w:spacing w:before="0" w:after="0" w:line="276" w:lineRule="auto"/>
+              <w:jc w:val="right"/>
+              <w:bidi/>
+            </w:pPr>
+            <w:r>
+              <w:rPr>
+                <w:rFonts w:ascii="Arial" w:hAnsi="Arial"/>
+                <w:b w:val="0"/>
+                <w:i w:val="0"/>
+                <w:color w:val="374151"/>
+                <w:sz w:val="20"/>
+                <w:rtl/>
+              </w:rPr>
+              <w:t>متوسط الوقت المنقضي بين فشل بناء ما ونجاح البناء الذي يليه.</w:t>
+            </w:r>
+          </w:p>
+        </w:tc>
+        <w:tc>
+          <w:tcPr>
+            <w:tcW w:type="dxa" w:w="3120"/>
+            <w:shd w:val="clear" w:color="auto" w:fill="FFFFFF"/>
+            <w:tcMar>
+              <w:top w:w="100" w:type="dxa"/>
+              <w:bottom w:w="100" w:type="dxa"/>
+              <w:left w:w="150" w:type="dxa"/>
+              <w:right w:w="150" w:type="dxa"/>
+            </w:tcMar>
+            <w:tcBorders>
+              <w:top w:val="single" w:sz="4" w:space="0" w:color="E2E8F0"/>
+              <w:left w:val="single" w:sz="4" w:space="0" w:color="E2E8F0"/>
+              <w:bottom w:val="single" w:sz="4" w:space="0" w:color="E2E8F0"/>
+              <w:right w:val="single" w:sz="4" w:space="0" w:color="E2E8F0"/>
+            </w:tcBorders>
+          </w:tcPr>
+          <w:p>
+            <w:pPr>
+              <w:spacing w:before="0" w:after="0" w:line="276" w:lineRule="auto"/>
+              <w:jc w:val="right"/>
+              <w:bidi/>
+            </w:pPr>
+            <w:r>
+              <w:rPr>
+                <w:rFonts w:ascii="Arial" w:hAnsi="Arial"/>
+                <w:b w:val="0"/>
+                <w:i w:val="0"/>
+                <w:color w:val="374151"/>
+                <w:sz w:val="20"/>
+                <w:rtl/>
+              </w:rPr>
+              <w:t>قياس كفاءة الفريق وسرعته في معالجة وحل المشكلات والأعطال.</w:t>
+            </w:r>
+          </w:p>
+        </w:tc>
+      </w:tr>
+    </w:tbl>
+    <w:p/>
     <w:p>
       <w:pPr>
+        <w:spacing w:before="320" w:after="160" w:line="276" w:lineRule="auto"/>
         <w:jc w:val="right"/>
         <w:bidi/>
       </w:pPr>
@@ -387,41 +1432,31 @@
         <w:rPr>
           <w:rFonts w:ascii="Arial" w:hAnsi="Arial"/>
           <w:b/>
-          <w:color w:val="10B981"/>
-          <w:sz w:val="24"/>
+          <w:i w:val="0"/>
+          <w:color w:val="0F172A"/>
+          <w:sz w:val="32"/>
           <w:rtl/>
         </w:rPr>
-        <w:t>هـ. لوحة تحليلات الأداء ومؤشر الاسترداد (Analytics &amp; MTTR Dashboard):</w:t>
+        <w:t>4. التحسينات البرمجية والتحسين الفوري</w:t>
       </w:r>
     </w:p>
     <w:p>
       <w:pPr>
+        <w:spacing w:before="0" w:after="240" w:line="276" w:lineRule="auto"/>
         <w:jc w:val="right"/>
         <w:bidi/>
       </w:pPr>
       <w:r>
         <w:rPr>
-          <w:rFonts w:ascii="Arial" w:hAnsi="Arial"/>
-          <w:b w:val="0"/>
-          <w:color w:val="374151"/>
-          <w:sz w:val="22"/>
-          <w:rtl/>
+          <w:color w:val="10B981"/>
+          <w:sz w:val="16"/>
         </w:rPr>
-        <w:t>تعتبر هذه اللوحة العقل المدبر لقياس كفاءة عمليات التطوير والتشغيل بالاعتماد على مؤشرات القياس العالمية (DORA Metrics). وتضم:</w:t>
-        <w:br/>
-        <w:t>- معدل نجاح البناء (Build Success Rate): نسبة مئوية توضح استقرار عمليات البناء.</w:t>
-        <w:br/>
-        <w:t>- وتيرة النشر اليومية (Deployment Frequency): متوسط عمليات النشر الفعلية يومياً.</w:t>
-        <w:br/>
-        <w:t>- متوسط وقت البناء (Avg Build Duration): تتبع زمن البناء وتحديد الاختناقات.</w:t>
-        <w:br/>
-        <w:t>- متوسط وقت الإصلاح (Mean Time to Resolution - MTTR): حساب دقيق للزمن المستغرق لحل حالات الفشل واستعادة استقرار النظام.</w:t>
-        <w:br/>
-        <w:t>- لوحة شرف الأداء (Pipeline Performance Leaderboard): جدول ذكي يرتب خطوط الأنابيب والمشاريع حسب كفاءتها ومعدل نجاحها الإجمالي مع إظهار اسم المشروع الفعلي لكل خط أنابيب.</w:t>
+        <w:t>━━━━━━━━━━━━━━━━━━━━━━━━━━━━━━━━━━━━━━━━━━━━━━━━━━</w:t>
       </w:r>
     </w:p>
     <w:p>
       <w:pPr>
+        <w:spacing w:before="0" w:after="160" w:line="276" w:lineRule="auto"/>
         <w:jc w:val="right"/>
         <w:bidi/>
       </w:pPr>
@@ -429,22 +1464,7 @@
         <w:rPr>
           <w:rFonts w:ascii="Arial" w:hAnsi="Arial"/>
           <w:b/>
-          <w:color w:val="0F172A"/>
-          <w:sz w:val="32"/>
-          <w:rtl/>
-        </w:rPr>
-        <w:t>4. التحسينات التقنية الأخيرة</w:t>
-      </w:r>
-    </w:p>
-    <w:p>
-      <w:pPr>
-        <w:jc w:val="right"/>
-        <w:bidi/>
-      </w:pPr>
-      <w:r>
-        <w:rPr>
-          <w:rFonts w:ascii="Arial" w:hAnsi="Arial"/>
-          <w:b/>
+          <w:i w:val="0"/>
           <w:color w:val="10B981"/>
           <w:sz w:val="22"/>
           <w:rtl/>
@@ -455,25 +1475,28 @@
         <w:rPr>
           <w:rFonts w:ascii="Arial" w:hAnsi="Arial"/>
           <w:b/>
+          <w:i w:val="0"/>
           <w:color w:val="0F172A"/>
           <w:sz w:val="22"/>
           <w:rtl/>
         </w:rPr>
-        <w:t>تسريع استجابة الواجهات البرمجية (API Optimization):</w:t>
+        <w:t xml:space="preserve">تسريع أداء جلب البيانات بالتوازي - </w:t>
       </w:r>
       <w:r>
         <w:rPr>
           <w:rFonts w:ascii="Arial" w:hAnsi="Arial"/>
           <w:b w:val="0"/>
+          <w:i w:val="0"/>
           <w:color w:val="374151"/>
           <w:sz w:val="22"/>
           <w:rtl/>
         </w:rPr>
-        <w:t xml:space="preserve"> تم استبدال الحلقات التكرارية المتعاقبة بحلقات معالجة متوازية باستخدام Task.WhenAll في خادم .NET عند جلب المشاريع والبيانات، مما أدى إلى تسريع جلب التحليلات بأكثر من 5 أضعاف.</w:t>
+        <w:t xml:space="preserve"> تم إعادة تصميم معالجة المهام البرمجية في الخلفية واستبدال الدوران المتعاقب بمهام متوازية باستخدام Task.WhenAll. أدى هذا الإجراء إلى تسريع جلب الإحصائيات والتحليلات بأكثر من 5 أضعاف مع تقليل استهلاك ذاكرة الخادم.</w:t>
       </w:r>
     </w:p>
     <w:p>
       <w:pPr>
+        <w:spacing w:before="0" w:after="160" w:line="276" w:lineRule="auto"/>
         <w:jc w:val="right"/>
         <w:bidi/>
       </w:pPr>
@@ -481,6 +1504,7 @@
         <w:rPr>
           <w:rFonts w:ascii="Arial" w:hAnsi="Arial"/>
           <w:b/>
+          <w:i w:val="0"/>
           <w:color w:val="10B981"/>
           <w:sz w:val="22"/>
           <w:rtl/>
@@ -491,25 +1515,28 @@
         <w:rPr>
           <w:rFonts w:ascii="Arial" w:hAnsi="Arial"/>
           <w:b/>
+          <w:i w:val="0"/>
           <w:color w:val="0F172A"/>
           <w:sz w:val="22"/>
           <w:rtl/>
         </w:rPr>
-        <w:t>مؤشرات التحميل المحلية (Local Loading Spinners):</w:t>
+        <w:t xml:space="preserve">دمج مؤشرات تحميل ذكية ومحلية - </w:t>
       </w:r>
       <w:r>
         <w:rPr>
           <w:rFonts w:ascii="Arial" w:hAnsi="Arial"/>
           <w:b w:val="0"/>
+          <w:i w:val="0"/>
           <w:color w:val="374151"/>
           <w:sz w:val="22"/>
           <w:rtl/>
         </w:rPr>
-        <w:t xml:space="preserve"> تم إلغاء شاشات التحميل الكاملة التي تخفي هيكل الصفحة، واستبدالها بمؤشرات تحميل دائرية مدمجة داخل كل بطاقة رسم بياني وجدول. هذا يحسن تجربة المستخدم ويمنع حدوث الإزاحات المفاجئة للهيكل (Layout Shifts) أثناء تحديث البيانات.</w:t>
+        <w:t xml:space="preserve"> تم إلغاء شاشات التحميل الكاملة المزعجة التي تسبب إزاحة مفاجئة في بنية الصفحة (Layout Pop). تم دمج مؤشرات تحميل دائرية (Spinners) خفيفة وشفافة داخل كل عنصر ورسم بياني بمفرده، مما يحافظ على ثبات الهيكل البصري عند تحديث الفلتر الزمني.</w:t>
       </w:r>
     </w:p>
     <w:p>
       <w:pPr>
+        <w:spacing w:before="0" w:after="160" w:line="276" w:lineRule="auto"/>
         <w:jc w:val="right"/>
         <w:bidi/>
       </w:pPr>
@@ -517,6 +1544,7 @@
         <w:rPr>
           <w:rFonts w:ascii="Arial" w:hAnsi="Arial"/>
           <w:b/>
+          <w:i w:val="0"/>
           <w:color w:val="10B981"/>
           <w:sz w:val="22"/>
           <w:rtl/>
@@ -527,25 +1555,29 @@
         <w:rPr>
           <w:rFonts w:ascii="Arial" w:hAnsi="Arial"/>
           <w:b/>
+          <w:i w:val="0"/>
           <w:color w:val="0F172A"/>
           <w:sz w:val="22"/>
           <w:rtl/>
         </w:rPr>
-        <w:t>التحميل الفوري للرسوم البيانية (Instant Chart Rendering):</w:t>
+        <w:t xml:space="preserve">المزامنة الفورية للرسوم البيانية - </w:t>
       </w:r>
       <w:r>
         <w:rPr>
           <w:rFonts w:ascii="Arial" w:hAnsi="Arial"/>
           <w:b w:val="0"/>
+          <w:i w:val="0"/>
           <w:color w:val="374151"/>
           <w:sz w:val="22"/>
           <w:rtl/>
         </w:rPr>
-        <w:t xml:space="preserve"> تم معالجة مشكلة تأخر رسم المخططات حتى الضغط الثاني، عبر استدعاء تهيئة الرسوم البيانية مباشرة بعد جلب البيانات وتحديث شجرة DOM، مما يضمن ظهور الرسوم بشكل فوري بمجرد فتح الصفحة.</w:t>
+        <w:t xml:space="preserve"> تم إلغاء فترات التأخير المرئي وتحسين تهيئة المخططات ورسمها مباشرة فور سحب البيانات من السيرفر، لتعرض الرسوم بنجاح وبشكل فوري بمجرد فتح الصفحة وبدء التفاعل معها.</w:t>
       </w:r>
     </w:p>
+    <w:p/>
     <w:p>
       <w:pPr>
+        <w:spacing w:before="320" w:after="160" w:line="276" w:lineRule="auto"/>
         <w:jc w:val="right"/>
         <w:bidi/>
       </w:pPr>
@@ -553,15 +1585,31 @@
         <w:rPr>
           <w:rFonts w:ascii="Arial" w:hAnsi="Arial"/>
           <w:b/>
+          <w:i w:val="0"/>
           <w:color w:val="0F172A"/>
           <w:sz w:val="32"/>
           <w:rtl/>
         </w:rPr>
-        <w:t>5. دليل التثبيت والتشغيل</w:t>
+        <w:t>5. دليل التنصيب والتشغيل السريع</w:t>
       </w:r>
     </w:p>
     <w:p>
       <w:pPr>
+        <w:spacing w:before="0" w:after="240" w:line="276" w:lineRule="auto"/>
+        <w:jc w:val="right"/>
+        <w:bidi/>
+      </w:pPr>
+      <w:r>
+        <w:rPr>
+          <w:color w:val="10B981"/>
+          <w:sz w:val="16"/>
+        </w:rPr>
+        <w:t>━━━━━━━━━━━━━━━━━━━━━━━━━━━━━━━━━━━━━━━━━━━━━━━━━━</w:t>
+      </w:r>
+    </w:p>
+    <w:p>
+      <w:pPr>
+        <w:spacing w:before="0" w:after="80" w:line="276" w:lineRule="auto"/>
         <w:jc w:val="right"/>
         <w:bidi/>
       </w:pPr>
@@ -569,15 +1617,18 @@
         <w:rPr>
           <w:rFonts w:ascii="Arial" w:hAnsi="Arial"/>
           <w:b/>
-          <w:color w:val="10B981"/>
+          <w:i w:val="0"/>
+          <w:color w:val="0F172A"/>
           <w:sz w:val="24"/>
           <w:rtl/>
         </w:rPr>
-        <w:t>أولا: تشغيل الواجهة الخلفية (Backend API Server)</w:t>
+        <w:t>أولاً: تشغيل خادم الواجهة الخلفية (.NET Backend Web API)</w:t>
       </w:r>
     </w:p>
     <w:p>
       <w:pPr>
+        <w:spacing w:before="40" w:after="160" w:line="276" w:lineRule="auto"/>
+        <w:ind w:right="288"/>
         <w:jc w:val="right"/>
         <w:bidi/>
       </w:pPr>
@@ -585,11 +1636,11 @@
         <w:rPr>
           <w:rFonts w:ascii="Arial" w:hAnsi="Arial"/>
           <w:b w:val="0"/>
-          <w:sz w:val="22"/>
+          <w:i/>
+          <w:color w:val="64748B"/>
+          <w:sz w:val="21"/>
           <w:rtl/>
         </w:rPr>
-        <w:t>افتح محرك الأوامر في مسار المشروع الرئيسي ثم قم بتشغيل الخادم عبر الأوامر التالية:</w:t>
-        <w:br/>
         <w:t>cd "Azure DevOps Integration/AzureDevOpsBackend"</w:t>
         <w:br/>
         <w:t>dotnet restore</w:t>
@@ -599,6 +1650,7 @@
     </w:p>
     <w:p>
       <w:pPr>
+        <w:spacing w:before="0" w:after="80" w:line="276" w:lineRule="auto"/>
         <w:jc w:val="right"/>
         <w:bidi/>
       </w:pPr>
@@ -606,15 +1658,18 @@
         <w:rPr>
           <w:rFonts w:ascii="Arial" w:hAnsi="Arial"/>
           <w:b/>
-          <w:color w:val="10B981"/>
+          <w:i w:val="0"/>
+          <w:color w:val="0F172A"/>
           <w:sz w:val="24"/>
           <w:rtl/>
         </w:rPr>
-        <w:t>ثانياً: تشغيل الواجهة الأمامية (Angular Frontend)</w:t>
+        <w:t>ثانياً: تشغيل تطبيق الواجهة الأمامية (Angular Frontend Client)</w:t>
       </w:r>
     </w:p>
     <w:p>
       <w:pPr>
+        <w:spacing w:before="40" w:after="240" w:line="276" w:lineRule="auto"/>
+        <w:ind w:right="288"/>
         <w:jc w:val="right"/>
         <w:bidi/>
       </w:pPr>
@@ -622,11 +1677,11 @@
         <w:rPr>
           <w:rFonts w:ascii="Arial" w:hAnsi="Arial"/>
           <w:b w:val="0"/>
-          <w:sz w:val="22"/>
+          <w:i/>
+          <w:color w:val="64748B"/>
+          <w:sz w:val="21"/>
           <w:rtl/>
         </w:rPr>
-        <w:t>افتح محرك الأوامر في مجلد الواجهة الأمامية ثم قم بتشغيل خادم التطوير:</w:t>
-        <w:br/>
         <w:t>cd "Azure DevOps Integration/AzureDevOpsFrontend"</w:t>
         <w:br/>
         <w:t>npm install</w:t>
@@ -634,30 +1689,56 @@
         <w:t>npm start</w:t>
       </w:r>
     </w:p>
-    <w:p>
-      <w:pPr>
-        <w:jc w:val="right"/>
-        <w:bidi/>
-      </w:pPr>
-      <w:r>
-        <w:rPr>
-          <w:rFonts w:ascii="Arial" w:hAnsi="Arial"/>
-          <w:b/>
-          <w:color w:val="0F172A"/>
-          <w:sz w:val="22"/>
-          <w:rtl/>
-        </w:rPr>
-        <w:t>بعد تشغيل الخادمين بنجاح، سيفتح التطبيق تلقائياً في المتصفح على الرابط: http://localhost:4200</w:t>
-      </w:r>
-    </w:p>
     <w:sectPr>
+      <w:headerReference w:type="default" r:id="rId9"/>
+      <w:footerReference w:type="default" r:id="rId10"/>
       <w:pgSz w:w="12240" w:h="15840"/>
-      <w:pgMar w:top="1440" w:right="1440" w:bottom="1440" w:left="1440" w:header="720" w:footer="720" w:gutter="0"/>
+      <w:pgMar w:top="1584" w:right="1440" w:bottom="1584" w:left="1440" w:header="720" w:footer="720" w:gutter="0"/>
       <w:cols w:space="720"/>
       <w:docGrid w:linePitch="360"/>
     </w:sectPr>
   </w:body>
 </w:document>
+</file>
+
+<file path=word/footer1.xml><?xml version="1.0" encoding="utf-8"?>
+<w:ftr xmlns:m="http://schemas.openxmlformats.org/officeDocument/2006/math" xmlns:mc="http://schemas.openxmlformats.org/markup-compatibility/2006" xmlns:mo="http://schemas.microsoft.com/office/mac/office/2008/main" xmlns:mv="urn:schemas-microsoft-com:mac:vml" xmlns:o="urn:schemas-microsoft-com:office:office" xmlns:r="http://schemas.openxmlformats.org/officeDocument/2006/relationships" xmlns:v="urn:schemas-microsoft-com:vml" xmlns:w10="urn:schemas-microsoft-com:office:word" xmlns:w14="http://schemas.microsoft.com/office/word/2010/wordml" xmlns:w="http://schemas.openxmlformats.org/wordprocessingml/2006/main" xmlns:wne="http://schemas.microsoft.com/office/word/2006/wordml" xmlns:wp14="http://schemas.microsoft.com/office/word/2010/wordprocessingDrawing" xmlns:wp="http://schemas.openxmlformats.org/drawingml/2006/wordprocessingDrawing" xmlns:wpc="http://schemas.microsoft.com/office/word/2010/wordprocessingCanvas" xmlns:wpg="http://schemas.microsoft.com/office/word/2010/wordprocessingGroup" xmlns:wpi="http://schemas.microsoft.com/office/word/2010/wordprocessingInk" xmlns:wps="http://schemas.microsoft.com/office/word/2010/wordprocessingShape" mc:Ignorable="w14 wp14">
+  <w:p>
+    <w:pPr>
+      <w:pStyle w:val="Footer"/>
+      <w:spacing w:before="0" w:after="0" w:line="276" w:lineRule="auto"/>
+      <w:jc w:val="center"/>
+      <w:bidi/>
+    </w:pPr>
+    <w:r>
+      <w:rPr>
+        <w:color w:val="64748B"/>
+        <w:sz w:val="17"/>
+      </w:rPr>
+      <w:t>صفحة 1 من 1 | سري وللاستخدام الداخلي</w:t>
+    </w:r>
+  </w:p>
+</w:ftr>
+</file>
+
+<file path=word/header1.xml><?xml version="1.0" encoding="utf-8"?>
+<w:hdr xmlns:m="http://schemas.openxmlformats.org/officeDocument/2006/math" xmlns:mc="http://schemas.openxmlformats.org/markup-compatibility/2006" xmlns:mo="http://schemas.microsoft.com/office/mac/office/2008/main" xmlns:mv="urn:schemas-microsoft-com:mac:vml" xmlns:o="urn:schemas-microsoft-com:office:office" xmlns:r="http://schemas.openxmlformats.org/officeDocument/2006/relationships" xmlns:v="urn:schemas-microsoft-com:vml" xmlns:w10="urn:schemas-microsoft-com:office:word" xmlns:w14="http://schemas.microsoft.com/office/word/2010/wordml" xmlns:w="http://schemas.openxmlformats.org/wordprocessingml/2006/main" xmlns:wne="http://schemas.microsoft.com/office/word/2006/wordml" xmlns:wp14="http://schemas.microsoft.com/office/word/2010/wordprocessingDrawing" xmlns:wp="http://schemas.openxmlformats.org/drawingml/2006/wordprocessingDrawing" xmlns:wpc="http://schemas.microsoft.com/office/word/2010/wordprocessingCanvas" xmlns:wpg="http://schemas.microsoft.com/office/word/2010/wordprocessingGroup" xmlns:wpi="http://schemas.microsoft.com/office/word/2010/wordprocessingInk" xmlns:wps="http://schemas.microsoft.com/office/word/2010/wordprocessingShape" mc:Ignorable="w14 wp14">
+  <w:p>
+    <w:pPr>
+      <w:pStyle w:val="Header"/>
+      <w:spacing w:before="0" w:after="0" w:line="276" w:lineRule="auto"/>
+      <w:jc w:val="left"/>
+      <w:bidi/>
+    </w:pPr>
+    <w:r>
+      <w:rPr>
+        <w:color w:val="64748B"/>
+        <w:sz w:val="17"/>
+      </w:rPr>
+      <w:t>بوابة تكامل Azure DevOps - دليل التوثيق الفني</w:t>
+    </w:r>
+  </w:p>
+</w:hdr>
 </file>
 
 <file path=word/numbering.xml><?xml version="1.0" encoding="utf-8"?>

</xml_diff>